<commit_message>
chore(dokumentation): upd docx template w/ Bundesland content
    ZFL-805
</commit_message>
<xml_diff>
--- a/public/documents/TEMPLATE_Dokumentation_der_Digitaltauglichkeit_Interoperabilitaet.docx
+++ b/public/documents/TEMPLATE_Dokumentation_der_Digitaltauglichkeit_Interoperabilitaet.docx
@@ -59,7 +59,7 @@
           <w:shd w:val="clear" w:color="auto" w:fill="cad1d7"/>
         </w:tblPrEx>
         <w:trPr>
-          <w:trHeight w:val="6855" w:hRule="atLeast"/>
+          <w:trHeight w:val="7129" w:hRule="atLeast"/>
         </w:trPr>
         <w:tc>
           <w:tcPr>
@@ -416,7 +416,39 @@
                 <w:rtl w:val="0"/>
                 <w:lang w:val="de-DE"/>
               </w:rPr>
-              <w:t xml:space="preserve"> und Skizzen sind vom NKR gern gesehen. H</w:t>
+              <w:t xml:space="preserve"> und Skizzen sind vom NKR</w:t>
+            </w:r>
+            <w:r>
+              <w:rPr>
+                <w:shd w:val="nil" w:color="auto" w:fill="auto"/>
+                <w:rtl w:val="0"/>
+                <w:lang w:val="de-DE"/>
+              </w:rPr>
+              <w:t xml:space="preserve"> und weiteren Pr</w:t>
+            </w:r>
+            <w:r>
+              <w:rPr>
+                <w:shd w:val="nil" w:color="auto" w:fill="auto"/>
+                <w:rtl w:val="0"/>
+                <w:lang w:val="de-DE"/>
+              </w:rPr>
+              <w:t>ü</w:t>
+            </w:r>
+            <w:r>
+              <w:rPr>
+                <w:shd w:val="nil" w:color="auto" w:fill="auto"/>
+                <w:rtl w:val="0"/>
+                <w:lang w:val="de-DE"/>
+              </w:rPr>
+              <w:t>fstellen</w:t>
+            </w:r>
+            <w:r>
+              <w:rPr>
+                <w:shd w:val="nil" w:color="auto" w:fill="auto"/>
+                <w:rtl w:val="0"/>
+                <w:lang w:val="de-DE"/>
+              </w:rPr>
+              <w:t xml:space="preserve"> gern gesehen. H</w:t>
             </w:r>
             <w:r>
               <w:rPr>

</xml_diff>